<commit_message>
cascade: issues_01: Group A source fixes AU-01..08/12/13 + hardening gates, atmosphere 1.2.1-dev-0.2.9 and speaker mistiq_vader 1.0.0-dev-0.0.1 images flashed (D1/D2), speaker board bring-up fixes (dtbo/fstab/boot header v2/sysprop/size floor/product-aware verifiers), pre-build triage 70->12 FAIL, Group B patch prep, V4/V5/V6 reworks, tracker ATM-1187..1197, progress docs W42
(committed by parent commit_all.sh cascade depth=1)
</commit_message>
<xml_diff>
--- a/README.docx
+++ b/README.docx
@@ -324,7 +324,7 @@
         <w:r>
           <w:drawing>
             <wp:inline>
-              <wp:extent cx="1438275" cy="266700"/>
+              <wp:extent cx="1524000" cy="266700"/>
               <wp:effectExtent b="0" l="0" r="0" t="0"/>
               <wp:docPr descr="Downloads" title="" id="30" name="Picture"/>
               <a:graphic>
@@ -354,7 +354,7 @@
                     <pic:spPr bwMode="auto">
                       <a:xfrm>
                         <a:off x="0" y="0"/>
-                        <a:ext cx="1438275" cy="266700"/>
+                        <a:ext cx="1524000" cy="266700"/>
                       </a:xfrm>
                       <a:prstGeom prst="rect">
                         <a:avLst/>
@@ -380,7 +380,7 @@
         <w:r>
           <w:drawing>
             <wp:inline>
-              <wp:extent cx="1066800" cy="266700"/>
+              <wp:extent cx="981075" cy="266700"/>
               <wp:effectExtent b="0" l="0" r="0" t="0"/>
               <wp:docPr descr="Stars" title="" id="34" name="Picture"/>
               <a:graphic>
@@ -410,7 +410,7 @@
                     <pic:spPr bwMode="auto">
                       <a:xfrm>
                         <a:off x="0" y="0"/>
-                        <a:ext cx="1066800" cy="266700"/>
+                        <a:ext cx="981075" cy="266700"/>
                       </a:xfrm>
                       <a:prstGeom prst="rect">
                         <a:avLst/>

</xml_diff>